<commit_message>
Add ERISApedia AI Search and Form 5500 work; credit AmericanTCS, now Ascensus
- Résumé and site: team-delivered AI Search (Ask ERISA) and Form 5500 data
  mining on ERISApedia, with public Ascensus scale (16M+ savers, $930B+ AUA)
- Client wording updated to AmericanTCS, acquired by Ascensus in 2026
- ERISApedia diagram gains a 'Powers' row for the two features

Co-Authored-By: Claude Opus 5.5 <noreply@anthropic.com>
Claude-Session: https://claude.ai/code/session_01NnvzLgjD7bP7S6VnAronJQ
</commit_message>
<xml_diff>
--- a/assets/Bibek-Gupta-Resume.docx
+++ b/assets/Bibek-Gupta-Resume.docx
@@ -62,7 +62,7 @@
           <w:b w:val="0"/>
           <w:i w:val="0"/>
         </w:rPr>
-        <w:t>Senior Software Engineer and Technical Lead with 8+ years building production SaaS, ERP, and enterprise systems in C#, .NET Core, SQL Server, and Microsoft Azure. Currently leading a team of 7-8 engineers rewriting ERISApedia (Ascensus) from legacy PHP to .NET Core, Angular, and MySQL on Azure and GCP. Previously Senior Engineer and Team Lead on PensionPro, a SaaS platform used by 400+ third-party administrator firms managing 230,000+ U.S. retirement plans. Founder of SastoRent and builder of multi-tenant SaaS products, including an AI natural-language reporting (NLQ) engine and a prepaid AI credit billing platform.</w:t>
+        <w:t>Senior Software Engineer and Technical Lead with 8+ years building production SaaS, ERP, and enterprise systems in C#, .NET Core, SQL Server, and Microsoft Azure. Currently leading a team of 7-8 engineers rewriting ERISApedia, an ERISA compliance-research platform now part of Ascensus, from legacy PHP to .NET Core, Angular, and MySQL on Azure and GCP, and shipping its AI Search (Ask ERISA) and Form 5500 data mining. Previously Senior Engineer and Team Lead on PensionPro, a SaaS platform used by 400+ third-party administrator firms managing 230,000+ U.S. retirement plans. Founder of SastoRent and builder of multi-tenant SaaS products, including an AI natural-language reporting (NLQ) engine and a prepaid AI credit billing platform.</w:t>
       </w:r>
     </w:p>
     <w:p>
@@ -188,7 +188,7 @@
         <w:t xml:space="preserve">AI &amp; Data: </w:t>
       </w:r>
       <w:r>
-        <w:t>LLM integration (OpenAI-compatible APIs), natural language to SQL (NLQ), semantic layer design, token metering, time-series forecasting</w:t>
+        <w:t>LLM integration (OpenAI-compatible APIs), LLM-powered search, natural language to SQL (NLQ), semantic layer design, token metering, time-series forecasting</w:t>
       </w:r>
     </w:p>
     <w:p>
@@ -255,7 +255,7 @@
           <w:b/>
           <w:i w:val="0"/>
         </w:rPr>
-        <w:t>DolphinDive Technology (client: Ascensus, USA) | Kathmandu, Nepal</w:t>
+        <w:t>DolphinDive Technology (client: AmericanTCS, acquired by Ascensus in 2026) | Kathmandu, Nepal</w:t>
       </w:r>
     </w:p>
     <w:p>
@@ -267,7 +267,7 @@
           <w:b w:val="0"/>
           <w:i/>
         </w:rPr>
-        <w:t>Engineering team for U.S. retirement-industry SaaS products under Ascensus, the largest U.S. retirement plan administration firm.</w:t>
+        <w:t>Engineering team for U.S. retirement-industry SaaS products (PensionPro, ERISApedia), now part of Ascensus, which serves 16M+ savers and $930B+ in assets under administration.</w:t>
       </w:r>
     </w:p>
     <w:p>
@@ -295,6 +295,34 @@
           <w:i w:val="0"/>
         </w:rPr>
         <w:t>Lead a team of 7-8 engineers on the ground-up rewrite of ERISApedia, an ERISA compliance-research platform, replacing a legacy PHP application with .NET Core, Angular, and MySQL.</w:t>
+      </w:r>
+    </w:p>
+    <w:p>
+      <w:pPr>
+        <w:pStyle w:val="ListBullet"/>
+        <w:spacing w:after="20"/>
+        <w:ind w:left="283"/>
+      </w:pPr>
+      <w:r>
+        <w:rPr>
+          <w:b w:val="0"/>
+          <w:i w:val="0"/>
+        </w:rPr>
+        <w:t>Team delivered AI Search (Ask ERISA), launched July 2026: LLM-powered answers across nine ERISA compliance book titles for advisors, auditors, and TPAs.</w:t>
+      </w:r>
+    </w:p>
+    <w:p>
+      <w:pPr>
+        <w:pStyle w:val="ListBullet"/>
+        <w:spacing w:after="20"/>
+        <w:ind w:left="283"/>
+      </w:pPr>
+      <w:r>
+        <w:rPr>
+          <w:b w:val="0"/>
+          <w:i w:val="0"/>
+        </w:rPr>
+        <w:t>Team built Form 5500 data mining: search across filings and attachments with hundreds of criteria, benchmarking, and map-based sales prospecting.</w:t>
       </w:r>
     </w:p>
     <w:p>

</xml_diff>

<commit_message>
Add performance work, release cadence, and mentoring scope
- ERISApedia: faster than legacy via component rewrites, query
  optimization, and API-layer caching
- PensionPro: releases every 2 to 4 weeks on Azure DevOps; mentored up to
  4 engineers plus QA at a time

Co-Authored-By: Claude Opus 5.5 <noreply@anthropic.com>
Claude-Session: https://claude.ai/code/session_01NnvzLgjD7bP7S6VnAronJQ
</commit_message>
<xml_diff>
--- a/assets/Bibek-Gupta-Resume.docx
+++ b/assets/Bibek-Gupta-Resume.docx
@@ -350,6 +350,20 @@
           <w:b w:val="0"/>
           <w:i w:val="0"/>
         </w:rPr>
+        <w:t>Made the new platform faster than the legacy PHP system by rewriting UI components, optimizing slow SQL queries, and adding API-layer caching.</w:t>
+      </w:r>
+    </w:p>
+    <w:p>
+      <w:pPr>
+        <w:pStyle w:val="ListBullet"/>
+        <w:spacing w:after="20"/>
+        <w:ind w:left="283"/>
+      </w:pPr>
+      <w:r>
+        <w:rPr>
+          <w:b w:val="0"/>
+          <w:i w:val="0"/>
+        </w:rPr>
         <w:t>Partner with U.S. stakeholders and engineers on architecture, scope, and sequencing to keep the rewrite aligned with product and compliance requirements.</w:t>
       </w:r>
     </w:p>
@@ -419,7 +433,7 @@
           <w:b w:val="0"/>
           <w:i w:val="0"/>
         </w:rPr>
-        <w:t>Established the CI/CD and release strategy on Azure DevOps: build and release pipelines, environment promotion, and deployment gates.</w:t>
+        <w:t>Established the CI/CD and release strategy on Azure DevOps: build and release pipelines, environment promotion, and deployment gates, supporting production releases every 2 to 4 weeks.</w:t>
       </w:r>
     </w:p>
     <w:p>
@@ -433,7 +447,7 @@
           <w:b w:val="0"/>
           <w:i w:val="0"/>
         </w:rPr>
-        <w:t>As Team Lead, set code review, design review, and coding standards and mentored engineers; served as primary engineering liaison translating pension-compliance requirements into technical designs.</w:t>
+        <w:t>As Team Lead, set code review, design review, and coding standards and mentored up to 4 engineers plus QA at a time; served as primary engineering liaison translating pension-compliance requirements into technical designs.</w:t>
       </w:r>
     </w:p>
     <w:p>

</xml_diff>

<commit_message>
Present SastoRent as freelance work
- Move SastoRent into the Also building list as a Freelance row that
  links to sastorent.com
- Update the section intro and remove unused card styles
- Résumé: list SastoRent as "Freelance, lead engineer"

Co-Authored-By: Claude Opus 5.5 <noreply@anthropic.com>
Claude-Session: https://claude.ai/code/session_01NnvzLgjD7bP7S6VnAronJQ
</commit_message>
<xml_diff>
--- a/assets/Bibek-Gupta-Resume.docx
+++ b/assets/Bibek-Gupta-Resume.docx
@@ -62,7 +62,7 @@
           <w:b w:val="0"/>
           <w:i w:val="0"/>
         </w:rPr>
-        <w:t>Senior Software Engineer and Technical Lead with 8+ years building production SaaS, ERP, and enterprise systems in C#, .NET Core, SQL Server, and Microsoft Azure. Currently leading a team of 7-8 engineers rewriting ERISApedia, an ERISA compliance-research platform now part of Ascensus, from legacy PHP to .NET Core, Angular, and MySQL on Azure and GCP, and shipping its AI Search (Ask ERISA) and Form 5500 data mining. Previously Senior Engineer and Team Lead on PensionPro, a SaaS platform used by 400+ third-party administrator firms managing 230,000+ U.S. retirement plans. Founder of SastoRent and builder of ForecastPro, an AI reporting SaaS in production with retail pharmacy chains in India.</w:t>
+        <w:t>Senior Software Engineer and Technical Lead with 8+ years building production SaaS, ERP, and enterprise systems in C#, .NET Core, SQL Server, and Microsoft Azure. Currently leading a team of 7-8 engineers rewriting ERISApedia, an ERISA compliance-research platform now part of Ascensus, from legacy PHP to .NET Core, Angular, and MySQL on Azure and GCP, and shipping its AI Search (Ask ERISA) and Form 5500 data mining. Previously Senior Engineer and Team Lead on PensionPro, a SaaS platform used by 400+ third-party administrator firms managing 230,000+ U.S. retirement plans. Also built ForecastPro, an AI reporting SaaS in production with retail pharmacy chains in India.</w:t>
       </w:r>
     </w:p>
     <w:p>
@@ -782,7 +782,7 @@
           <w:i w:val="0"/>
           <w:color w:val="1F3A70"/>
         </w:rPr>
-        <w:t>SastoRent - Founder &amp; Lead Engineer | sastorent.com</w:t>
+        <w:t>SastoRent - Rental and services marketplace | Freelance, lead engineer</w:t>
       </w:r>
     </w:p>
     <w:p>
@@ -796,7 +796,7 @@
           <w:b w:val="0"/>
           <w:i w:val="0"/>
         </w:rPr>
-        <w:t>Building a marketplace where people rent out properties and everyday items, and where service providers such as plumbers, carpenters, and tutors register and sell their services.</w:t>
+        <w:t>Built a marketplace (sastorent.com) where people rent out properties and everyday items, and where service providers such as plumbers, carpenters, and tutors register and sell their services.</w:t>
       </w:r>
     </w:p>
     <w:p>

</xml_diff>

<commit_message>
Add ERISApedia data pipelines and PensionPro scaling details
- ERISApedia: Form 5500 and DOL data scraping and mining on Google Cloud
  (Cloud Run functions, Cloud Tasks, Cloud Storage, BigQuery), EF Core
  and Redis distributed caching; diagram and tags updated
- PensionPro: read path with Redis distributed caching, read-only
  replicas, a search-only database and Elasticsearch; integrations with
  ERISApedia, ftwilliam.com, DocuSign and Form 5500 data; companion apps
  Fetch and PlanSponsorLinks; diagram and tags updated
- Résumé: same details, skills updated, still two pages

Co-Authored-By: Claude Opus 5.5 <noreply@anthropic.com>
Claude-Session: https://claude.ai/code/session_01NnvzLgjD7bP7S6VnAronJQ
</commit_message>
<xml_diff>
--- a/assets/Bibek-Gupta-Resume.docx
+++ b/assets/Bibek-Gupta-Resume.docx
@@ -132,7 +132,7 @@
         <w:t xml:space="preserve">Cloud &amp; DevOps: </w:t>
       </w:r>
       <w:r>
-        <w:t>Microsoft Azure (Functions, Logic Apps, Service Bus, Event Grid, App Service, Storage, Azure AD), Google Cloud Platform, Docker, Azure DevOps, GitHub Actions, CI/CD, Linux, Nginx</w:t>
+        <w:t>Microsoft Azure (Functions, Logic Apps, Service Bus, Event Grid, App Service, Storage, Azure AD), Google Cloud Platform (Cloud Run functions, Cloud Tasks, Cloud Storage, BigQuery), Docker, Azure DevOps, GitHub Actions, CI/CD, Linux, Nginx</w:t>
       </w:r>
     </w:p>
     <w:p>
@@ -146,7 +146,7 @@
         <w:t xml:space="preserve">Databases: </w:t>
       </w:r>
       <w:r>
-        <w:t>SQL Server, PostgreSQL, MySQL, Redis, SQLite, Prisma, query and schema optimization</w:t>
+        <w:t>SQL Server, PostgreSQL, MySQL, Redis, Elasticsearch, BigQuery, read replicas, query optimization</w:t>
       </w:r>
     </w:p>
     <w:p>
@@ -294,7 +294,7 @@
           <w:b w:val="0"/>
           <w:i w:val="0"/>
         </w:rPr>
-        <w:t>Lead a team of 7-8 engineers on the ground-up rewrite of ERISApedia, an ERISA compliance-research platform, replacing a legacy PHP application with .NET Core, Angular, and MySQL.</w:t>
+        <w:t>Lead a team of 7-8 engineers on the ground-up rewrite of ERISApedia, an ERISA compliance-research platform, replacing a legacy PHP application with .NET Core, EF Core, Angular, MySQL, and Redis.</w:t>
       </w:r>
     </w:p>
     <w:p>
@@ -322,7 +322,7 @@
           <w:b w:val="0"/>
           <w:i w:val="0"/>
         </w:rPr>
-        <w:t>Team built Form 5500 data mining: search across filings and attachments with hundreds of criteria, benchmarking, and map-based sales prospecting.</w:t>
+        <w:t>Team built Form 5500 and DOL data pipelines that scrape and mine public filings on Google Cloud (Cloud Run functions, Cloud Tasks, Cloud Storage, BigQuery), searchable on hundreds of criteria with benchmarking.</w:t>
       </w:r>
     </w:p>
     <w:p>
@@ -336,7 +336,7 @@
           <w:b w:val="0"/>
           <w:i w:val="0"/>
         </w:rPr>
-        <w:t>Own the target architecture, technology selection, and migration path off the legacy system; designed the cloud architecture across Microsoft Azure and Google Cloud Platform.</w:t>
+        <w:t>Own the target architecture, technology selection, and migration path off the legacy system, and the cloud design across Azure and GCP, working with U.S. stakeholders on scope and sequencing.</w:t>
       </w:r>
     </w:p>
     <w:p>
@@ -350,21 +350,7 @@
           <w:b w:val="0"/>
           <w:i w:val="0"/>
         </w:rPr>
-        <w:t>Made the new platform faster than the legacy PHP system by rewriting UI components, optimizing slow SQL queries, and adding API-layer caching.</w:t>
-      </w:r>
-    </w:p>
-    <w:p>
-      <w:pPr>
-        <w:pStyle w:val="ListBullet"/>
-        <w:spacing w:after="20"/>
-        <w:ind w:left="283"/>
-      </w:pPr>
-      <w:r>
-        <w:rPr>
-          <w:b w:val="0"/>
-          <w:i w:val="0"/>
-        </w:rPr>
-        <w:t>Partner with U.S. stakeholders and engineers on architecture, scope, and sequencing to keep the rewrite aligned with product and compliance requirements.</w:t>
+        <w:t>Made the new platform faster than the legacy PHP system by rewriting UI components, optimizing slow SQL queries, and adding Redis distributed caching at the API layer.</w:t>
       </w:r>
     </w:p>
     <w:p>
@@ -391,7 +377,21 @@
           <w:b w:val="0"/>
           <w:i w:val="0"/>
         </w:rPr>
-        <w:t>Delivered features across the full stack (C#, .NET Core, Angular, SQL Server, Redis) of a pension administration SaaS used by 400+ TPA firms administering 230,000+ retirement plans.</w:t>
+        <w:t>Delivered features across the full stack (C#, .NET Core, Angular, SQL Server) of a pension administration SaaS used by 400+ TPA firms administering 230,000+ retirement plans, and its companion apps Fetch and PlanSponsorLinks.</w:t>
+      </w:r>
+    </w:p>
+    <w:p>
+      <w:pPr>
+        <w:pStyle w:val="ListBullet"/>
+        <w:spacing w:after="20"/>
+        <w:ind w:left="283"/>
+      </w:pPr>
+      <w:r>
+        <w:rPr>
+          <w:b w:val="0"/>
+          <w:i w:val="0"/>
+        </w:rPr>
+        <w:t>Worked on a read path built for scale: Redis distributed caching, read-only database replicas, a search-only database, and Elasticsearch.</w:t>
       </w:r>
     </w:p>
     <w:p>
@@ -419,7 +419,7 @@
           <w:b w:val="0"/>
           <w:i w:val="0"/>
         </w:rPr>
-        <w:t>Integrated DocuSign, Zendesk, ftwilliam.com, QuickBooks Online, and Braintree; implemented SAML 2.0 single sign-on and identity management.</w:t>
+        <w:t>Integrated ERISApedia, ftwilliam.com, DocuSign, and Form 5500 data, plus Zendesk, QuickBooks Online, and Braintree; implemented SAML 2.0 single sign-on and identity management.</w:t>
       </w:r>
     </w:p>
     <w:p>
@@ -713,7 +713,7 @@
           <w:b w:val="0"/>
           <w:i w:val="0"/>
         </w:rPr>
-        <w:t>In production with a few large retail pharmacy chains in India: syncs their ERP data, forecasts demand, and answers business questions asked in plain English.</w:t>
+        <w:t>In production with a few large retail pharmacy chains in India: syncs their ERP data through a resumable pipeline, forecasts demand, and answers business questions asked in plain English.</w:t>
       </w:r>
     </w:p>
     <w:p>
@@ -756,20 +756,6 @@
           <w:i w:val="0"/>
         </w:rPr>
         <w:t>Built prepaid AI credit billing: append-only ledger enforced by database triggers, reservation-based charging, per-tenant pricing and spend limits, and signature-verified, idempotent Stripe webhooks.</w:t>
-      </w:r>
-    </w:p>
-    <w:p>
-      <w:pPr>
-        <w:pStyle w:val="ListBullet"/>
-        <w:spacing w:after="20"/>
-        <w:ind w:left="283"/>
-      </w:pPr>
-      <w:r>
-        <w:rPr>
-          <w:b w:val="0"/>
-          <w:i w:val="0"/>
-        </w:rPr>
-        <w:t>Built a resumable ERP data sync pipeline with queue-based, per-tenant worker concurrency.</w:t>
       </w:r>
     </w:p>
     <w:p>

</xml_diff>

<commit_message>
Add PensionPro API gateway and architecture ownership
- PensionPro: designed and architected a YARP API gateway for external
  APIs, with authentication and rate limits using Redis distributed locks
  (Redlock), mutexes and semaphores; role notes major contribution to the
  .NET Core architecture; diagram, tags and leadership card updated
- Résumé: same details, skills add YARP and distributed locking; still
  two pages

Co-Authored-By: Claude Opus 5.5 <noreply@anthropic.com>
Claude-Session: https://claude.ai/code/session_01NnvzLgjD7bP7S6VnAronJQ
</commit_message>
<xml_diff>
--- a/assets/Bibek-Gupta-Resume.docx
+++ b/assets/Bibek-Gupta-Resume.docx
@@ -104,7 +104,7 @@
         <w:t xml:space="preserve">Backend: </w:t>
       </w:r>
       <w:r>
-        <w:t>.NET 8, .NET Core, ASP.NET Core Web API, Entity Framework Core, Dapper, Node.js, NestJS, Express, REST APIs, WebSockets, SignalR, background jobs (Quartz.NET, BullMQ)</w:t>
+        <w:t>.NET 8, .NET Core, ASP.NET Core Web API, Entity Framework Core, Dapper, Node.js, NestJS, Express, REST APIs, YARP API gateway, WebSockets, SignalR, background jobs (Quartz.NET, BullMQ)</w:t>
       </w:r>
     </w:p>
     <w:p>
@@ -118,7 +118,7 @@
         <w:t xml:space="preserve">Architecture: </w:t>
       </w:r>
       <w:r>
-        <w:t>System design, Clean Architecture, microservices, event-driven architecture, serverless, multi-tenant SaaS, legacy modernization, API design, RBAC, high availability</w:t>
+        <w:t>System design, Clean Architecture, microservices, event-driven architecture, serverless, multi-tenant SaaS, legacy modernization, API gateways, distributed locking (Redlock), API design, RBAC, high availability</w:t>
       </w:r>
     </w:p>
     <w:p>
@@ -377,7 +377,21 @@
           <w:b w:val="0"/>
           <w:i w:val="0"/>
         </w:rPr>
-        <w:t>Delivered features across the full stack (C#, .NET Core, Angular, SQL Server) of a pension administration SaaS used by 400+ TPA firms administering 230,000+ retirement plans, and its companion apps Fetch and PlanSponsorLinks.</w:t>
+        <w:t>Major contributor to the .NET Core architecture of a pension administration SaaS used by 400+ TPA firms administering 230,000+ retirement plans, and its companion apps Fetch and PlanSponsorLinks.</w:t>
+      </w:r>
+    </w:p>
+    <w:p>
+      <w:pPr>
+        <w:pStyle w:val="ListBullet"/>
+        <w:spacing w:after="20"/>
+        <w:ind w:left="283"/>
+      </w:pPr>
+      <w:r>
+        <w:rPr>
+          <w:b w:val="0"/>
+          <w:i w:val="0"/>
+        </w:rPr>
+        <w:t>Designed and architected a YARP-based API gateway for the platform's external APIs, handling authentication and rate limiting with Redis distributed locks (Redlock), mutexes, and semaphores.</w:t>
       </w:r>
     </w:p>
     <w:p>

</xml_diff>

<commit_message>
Clarify Azure DevOps ownership and add Azure Storage services
- Build (CI) pipelines are the team's work; release pipelines belong to
  the DevOps team. Updated the stats strip, PensionPro card, diagram,
  leadership card and résumé to say so
- Add Azure Queue Storage and Table Storage alongside Service Bus on the
  PensionPro card, diagram, tags and résumé skills

Co-Authored-By: Claude Opus 5.5 <noreply@anthropic.com>
Claude-Session: https://claude.ai/code/session_01NnvzLgjD7bP7S6VnAronJQ
</commit_message>
<xml_diff>
--- a/assets/Bibek-Gupta-Resume.docx
+++ b/assets/Bibek-Gupta-Resume.docx
@@ -132,7 +132,7 @@
         <w:t xml:space="preserve">Cloud &amp; DevOps: </w:t>
       </w:r>
       <w:r>
-        <w:t>Microsoft Azure (Functions, Logic Apps, Service Bus, Event Grid, App Service, Storage, Azure AD), Google Cloud Platform (Cloud Run functions, Cloud Tasks, Cloud Storage, BigQuery), Docker, Azure DevOps, GitHub Actions, CI/CD, Linux, Nginx</w:t>
+        <w:t>Microsoft Azure (Functions, Logic Apps, Service Bus, Queue Storage, Table Storage, Event Grid, App Service, Azure AD), Google Cloud Platform (Cloud Run functions, Cloud Tasks, Cloud Storage, BigQuery), Docker, Azure DevOps, GitHub Actions, CI/CD, Linux, Nginx</w:t>
       </w:r>
     </w:p>
     <w:p>
@@ -419,7 +419,7 @@
           <w:b w:val="0"/>
           <w:i w:val="0"/>
         </w:rPr>
-        <w:t>Moved long-running and integration-heavy work off the request path using Azure Service Bus, Storage queues and tables, Azure Functions (all trigger types), Logic Apps, and Event Grid, so background processing scales independently of user traffic.</w:t>
+        <w:t>Moved long-running and integration-heavy work off the request path using Azure Service Bus, Storage queues and Table Storage, Azure Functions (all trigger types), Logic Apps, and Event Grid, so background processing scales independently of user traffic.</w:t>
       </w:r>
     </w:p>
     <w:p>
@@ -447,7 +447,7 @@
           <w:b w:val="0"/>
           <w:i w:val="0"/>
         </w:rPr>
-        <w:t>Established the CI/CD and release strategy on Azure DevOps: build and release pipelines, environment promotion, and deployment gates, supporting production releases every 2 to 4 weeks.</w:t>
+        <w:t>Built and maintained Azure DevOps build (CI) pipelines, working with the DevOps team that owns release pipelines on a 2 to 4 week production release cadence.</w:t>
       </w:r>
     </w:p>
     <w:p>

</xml_diff>

<commit_message>
Add SonarQube code analysis to the build pipelines
- PensionPro card, diagram, tags and leadership card mention SonarQube
  in the Azure DevOps build (CI) pipelines
- Résumé: build pipeline bullet and DevOps skills list SonarQube

Co-Authored-By: Claude Opus 5.5 <noreply@anthropic.com>
Claude-Session: https://claude.ai/code/session_01NnvzLgjD7bP7S6VnAronJQ
</commit_message>
<xml_diff>
--- a/assets/Bibek-Gupta-Resume.docx
+++ b/assets/Bibek-Gupta-Resume.docx
@@ -132,7 +132,7 @@
         <w:t xml:space="preserve">Cloud &amp; DevOps: </w:t>
       </w:r>
       <w:r>
-        <w:t>Microsoft Azure (Functions, Logic Apps, Service Bus, Queue Storage, Table Storage, Event Grid, App Service, Azure AD), Google Cloud Platform (Cloud Run functions, Cloud Tasks, Cloud Storage, BigQuery), Docker, Azure DevOps, GitHub Actions, CI/CD, Linux, Nginx</w:t>
+        <w:t>Microsoft Azure (Functions, Logic Apps, Service Bus, Queue Storage, Table Storage, Event Grid, App Service, Azure AD), Google Cloud Platform (Cloud Run functions, Cloud Tasks, Cloud Storage, BigQuery), Docker, Azure DevOps, GitHub Actions, CI/CD, SonarQube, Linux, Nginx</w:t>
       </w:r>
     </w:p>
     <w:p>
@@ -447,7 +447,7 @@
           <w:b w:val="0"/>
           <w:i w:val="0"/>
         </w:rPr>
-        <w:t>Built and maintained Azure DevOps build (CI) pipelines, working with the DevOps team that owns release pipelines on a 2 to 4 week production release cadence.</w:t>
+        <w:t>Built and maintained Azure DevOps build (CI) pipelines with SonarQube code analysis, working with the DevOps team that owns release pipelines on a 2 to 4 week production release cadence.</w:t>
       </w:r>
     </w:p>
     <w:p>

</xml_diff>